<commit_message>
Update Lab 6 for posting: uncomment video with CPS note, refresh LPM wording, rebuild PDF; remove legacy .tex files
Co-Authored-By: Claude Opus 4.6 (1M context) <noreply@anthropic.com>
</commit_message>
<xml_diff>
--- a/slides/ch8b/ch8b_wine_health_worksheet.docx
+++ b/slides/ch8b/ch8b_wine_health_worksheet.docx
@@ -493,7 +493,25 @@
           <w:sz w:val="21"/>
           <w:szCs w:val="21"/>
         </w:rPr>
-        <w:t>Any variables that can be combined? Simplify as much as possible</w:t>
+        <w:t xml:space="preserve">Any variables that can be combined? </w:t>
+      </w:r>
+      <w:r>
+        <w:rPr>
+          <w:rFonts w:ascii="Aptos" w:hAnsi="Aptos"/>
+          <w:color w:val="000000" w:themeColor="text1"/>
+          <w:sz w:val="21"/>
+          <w:szCs w:val="21"/>
+        </w:rPr>
+        <w:t>Draw a new DAG, simplifying</w:t>
+      </w:r>
+      <w:r>
+        <w:rPr>
+          <w:rFonts w:ascii="Aptos" w:hAnsi="Aptos"/>
+          <w:color w:val="000000" w:themeColor="text1"/>
+          <w:sz w:val="21"/>
+          <w:szCs w:val="21"/>
+        </w:rPr>
+        <w:t xml:space="preserve"> as much as possible</w:t>
       </w:r>
     </w:p>
     <w:p>

</xml_diff>